<commit_message>
Add requisition DOCX generation and download
Introduce server-side generation of requisition .docx files and client support for downloading them. Adds back/src/data/Requisicao.ts to render a Requisicao.docx template into a buffer, registers a new /download-requisicao POST route (and an /open GET helper) in back/src/index.ts, and updates back/src/data/Resultado.ts to use empresa.name for the template. On the frontend, the Exame hook (useExame) now accepts a requisicao flag to call the new endpoint and set an appropriate filename, and the exam page adds a button to download the requisition. Also updates the Resultado.docx asset.
</commit_message>
<xml_diff>
--- a/back/assets/Resultado.docx
+++ b/back/assets/Resultado.docx
@@ -2037,12 +2037,14 @@
                             <w:r>
                               <w:t>%</w:t>
                             </w:r>
+                            <w:proofErr w:type="spellStart"/>
                             <w:r>
                               <w:t>resultado</w:t>
                             </w:r>
                             <w:r>
                               <w:t>E</w:t>
                             </w:r>
+                            <w:proofErr w:type="spellEnd"/>
                             <w:r>
                               <w:t>}</w:t>
                             </w:r>
@@ -2157,8 +2159,13 @@
                             <w:r>
                               <w:t>%</w:t>
                             </w:r>
-                            <w:r>
-                              <w:t>resultadoD}</w:t>
+                            <w:proofErr w:type="spellStart"/>
+                            <w:r>
+                              <w:t>resultadoD</w:t>
+                            </w:r>
+                            <w:proofErr w:type="spellEnd"/>
+                            <w:r>
+                              <w:t>}</w:t>
                             </w:r>
                           </w:p>
                         </w:txbxContent>
@@ -2275,7 +2282,21 @@
                               <w:rPr>
                                 <w:rFonts w:cs="Arial"/>
                               </w:rPr>
-                              <w:t>{calibração}</w:t>
+                              <w:t>{</w:t>
+                            </w:r>
+                            <w:proofErr w:type="spellStart"/>
+                            <w:r>
+                              <w:rPr>
+                                <w:rFonts w:cs="Arial"/>
+                              </w:rPr>
+                              <w:t>calibracao</w:t>
+                            </w:r>
+                            <w:proofErr w:type="spellEnd"/>
+                            <w:r>
+                              <w:rPr>
+                                <w:rFonts w:cs="Arial"/>
+                              </w:rPr>
+                              <w:t>}</w:t>
                             </w:r>
                           </w:p>
                           <w:tbl>
@@ -2322,6 +2343,7 @@
                                       <w14:ligatures w14:val="none"/>
                                     </w:rPr>
                                   </w:pPr>
+                                  <w:proofErr w:type="spellStart"/>
                                   <w:r>
                                     <w:rPr>
                                       <w:rFonts w:ascii="Arial" w:eastAsia="Times New Roman" w:hAnsi="Arial" w:cs="Arial"/>
@@ -2332,7 +2354,46 @@
                                       <w:lang w:eastAsia="pt-BR"/>
                                       <w14:ligatures w14:val="none"/>
                                     </w:rPr>
-                                    <w:t>Dt Nasc:</w:t>
+                                    <w:t>Dt</w:t>
+                                  </w:r>
+                                  <w:proofErr w:type="spellEnd"/>
+                                  <w:r>
+                                    <w:rPr>
+                                      <w:rFonts w:ascii="Arial" w:eastAsia="Times New Roman" w:hAnsi="Arial" w:cs="Arial"/>
+                                      <w:color w:val="000000"/>
+                                      <w:kern w:val="0"/>
+                                      <w:sz w:val="32"/>
+                                      <w:szCs w:val="32"/>
+                                      <w:lang w:eastAsia="pt-BR"/>
+                                      <w14:ligatures w14:val="none"/>
+                                    </w:rPr>
+                                    <w:t xml:space="preserve"> </w:t>
+                                  </w:r>
+                                  <w:proofErr w:type="spellStart"/>
+                                  <w:r>
+                                    <w:rPr>
+                                      <w:rFonts w:ascii="Arial" w:eastAsia="Times New Roman" w:hAnsi="Arial" w:cs="Arial"/>
+                                      <w:color w:val="000000"/>
+                                      <w:kern w:val="0"/>
+                                      <w:sz w:val="32"/>
+                                      <w:szCs w:val="32"/>
+                                      <w:lang w:eastAsia="pt-BR"/>
+                                      <w14:ligatures w14:val="none"/>
+                                    </w:rPr>
+                                    <w:t>Nasc</w:t>
+                                  </w:r>
+                                  <w:proofErr w:type="spellEnd"/>
+                                  <w:r>
+                                    <w:rPr>
+                                      <w:rFonts w:ascii="Arial" w:eastAsia="Times New Roman" w:hAnsi="Arial" w:cs="Arial"/>
+                                      <w:color w:val="000000"/>
+                                      <w:kern w:val="0"/>
+                                      <w:sz w:val="32"/>
+                                      <w:szCs w:val="32"/>
+                                      <w:lang w:eastAsia="pt-BR"/>
+                                      <w14:ligatures w14:val="none"/>
+                                    </w:rPr>
+                                    <w:t>:</w:t>
                                   </w:r>
                                 </w:p>
                               </w:tc>
@@ -2435,7 +2496,21 @@
                         <w:rPr>
                           <w:rFonts w:cs="Arial"/>
                         </w:rPr>
-                        <w:t>{calibração}</w:t>
+                        <w:t>{</w:t>
+                      </w:r>
+                      <w:proofErr w:type="spellStart"/>
+                      <w:r>
+                        <w:rPr>
+                          <w:rFonts w:cs="Arial"/>
+                        </w:rPr>
+                        <w:t>calibracao</w:t>
+                      </w:r>
+                      <w:proofErr w:type="spellEnd"/>
+                      <w:r>
+                        <w:rPr>
+                          <w:rFonts w:cs="Arial"/>
+                        </w:rPr>
+                        <w:t>}</w:t>
                       </w:r>
                     </w:p>
                     <w:tbl>
@@ -2482,6 +2557,7 @@
                                 <w14:ligatures w14:val="none"/>
                               </w:rPr>
                             </w:pPr>
+                            <w:proofErr w:type="spellStart"/>
                             <w:r>
                               <w:rPr>
                                 <w:rFonts w:ascii="Arial" w:eastAsia="Times New Roman" w:hAnsi="Arial" w:cs="Arial"/>
@@ -2492,7 +2568,46 @@
                                 <w:lang w:eastAsia="pt-BR"/>
                                 <w14:ligatures w14:val="none"/>
                               </w:rPr>
-                              <w:t>Dt Nasc:</w:t>
+                              <w:t>Dt</w:t>
+                            </w:r>
+                            <w:proofErr w:type="spellEnd"/>
+                            <w:r>
+                              <w:rPr>
+                                <w:rFonts w:ascii="Arial" w:eastAsia="Times New Roman" w:hAnsi="Arial" w:cs="Arial"/>
+                                <w:color w:val="000000"/>
+                                <w:kern w:val="0"/>
+                                <w:sz w:val="32"/>
+                                <w:szCs w:val="32"/>
+                                <w:lang w:eastAsia="pt-BR"/>
+                                <w14:ligatures w14:val="none"/>
+                              </w:rPr>
+                              <w:t xml:space="preserve"> </w:t>
+                            </w:r>
+                            <w:proofErr w:type="spellStart"/>
+                            <w:r>
+                              <w:rPr>
+                                <w:rFonts w:ascii="Arial" w:eastAsia="Times New Roman" w:hAnsi="Arial" w:cs="Arial"/>
+                                <w:color w:val="000000"/>
+                                <w:kern w:val="0"/>
+                                <w:sz w:val="32"/>
+                                <w:szCs w:val="32"/>
+                                <w:lang w:eastAsia="pt-BR"/>
+                                <w14:ligatures w14:val="none"/>
+                              </w:rPr>
+                              <w:t>Nasc</w:t>
+                            </w:r>
+                            <w:proofErr w:type="spellEnd"/>
+                            <w:r>
+                              <w:rPr>
+                                <w:rFonts w:ascii="Arial" w:eastAsia="Times New Roman" w:hAnsi="Arial" w:cs="Arial"/>
+                                <w:color w:val="000000"/>
+                                <w:kern w:val="0"/>
+                                <w:sz w:val="32"/>
+                                <w:szCs w:val="32"/>
+                                <w:lang w:eastAsia="pt-BR"/>
+                                <w14:ligatures w14:val="none"/>
+                              </w:rPr>
+                              <w:t>:</w:t>
                             </w:r>
                           </w:p>
                         </w:tc>
@@ -2778,6 +2893,7 @@
                                       <w14:ligatures w14:val="none"/>
                                     </w:rPr>
                                   </w:pPr>
+                                  <w:proofErr w:type="spellStart"/>
                                   <w:r>
                                     <w:rPr>
                                       <w:rFonts w:ascii="Arial" w:eastAsia="Times New Roman" w:hAnsi="Arial" w:cs="Arial"/>
@@ -2788,7 +2904,46 @@
                                       <w:lang w:eastAsia="pt-BR"/>
                                       <w14:ligatures w14:val="none"/>
                                     </w:rPr>
-                                    <w:t>Dt Nasc:</w:t>
+                                    <w:t>Dt</w:t>
+                                  </w:r>
+                                  <w:proofErr w:type="spellEnd"/>
+                                  <w:r>
+                                    <w:rPr>
+                                      <w:rFonts w:ascii="Arial" w:eastAsia="Times New Roman" w:hAnsi="Arial" w:cs="Arial"/>
+                                      <w:color w:val="000000"/>
+                                      <w:kern w:val="0"/>
+                                      <w:sz w:val="32"/>
+                                      <w:szCs w:val="32"/>
+                                      <w:lang w:eastAsia="pt-BR"/>
+                                      <w14:ligatures w14:val="none"/>
+                                    </w:rPr>
+                                    <w:t xml:space="preserve"> </w:t>
+                                  </w:r>
+                                  <w:proofErr w:type="spellStart"/>
+                                  <w:r>
+                                    <w:rPr>
+                                      <w:rFonts w:ascii="Arial" w:eastAsia="Times New Roman" w:hAnsi="Arial" w:cs="Arial"/>
+                                      <w:color w:val="000000"/>
+                                      <w:kern w:val="0"/>
+                                      <w:sz w:val="32"/>
+                                      <w:szCs w:val="32"/>
+                                      <w:lang w:eastAsia="pt-BR"/>
+                                      <w14:ligatures w14:val="none"/>
+                                    </w:rPr>
+                                    <w:t>Nasc</w:t>
+                                  </w:r>
+                                  <w:proofErr w:type="spellEnd"/>
+                                  <w:r>
+                                    <w:rPr>
+                                      <w:rFonts w:ascii="Arial" w:eastAsia="Times New Roman" w:hAnsi="Arial" w:cs="Arial"/>
+                                      <w:color w:val="000000"/>
+                                      <w:kern w:val="0"/>
+                                      <w:sz w:val="32"/>
+                                      <w:szCs w:val="32"/>
+                                      <w:lang w:eastAsia="pt-BR"/>
+                                      <w14:ligatures w14:val="none"/>
+                                    </w:rPr>
+                                    <w:t>:</w:t>
                                   </w:r>
                                 </w:p>
                               </w:tc>
@@ -3038,6 +3193,7 @@
                                 <w14:ligatures w14:val="none"/>
                               </w:rPr>
                             </w:pPr>
+                            <w:proofErr w:type="spellStart"/>
                             <w:r>
                               <w:rPr>
                                 <w:rFonts w:ascii="Arial" w:eastAsia="Times New Roman" w:hAnsi="Arial" w:cs="Arial"/>
@@ -3048,7 +3204,46 @@
                                 <w:lang w:eastAsia="pt-BR"/>
                                 <w14:ligatures w14:val="none"/>
                               </w:rPr>
-                              <w:t>Dt Nasc:</w:t>
+                              <w:t>Dt</w:t>
+                            </w:r>
+                            <w:proofErr w:type="spellEnd"/>
+                            <w:r>
+                              <w:rPr>
+                                <w:rFonts w:ascii="Arial" w:eastAsia="Times New Roman" w:hAnsi="Arial" w:cs="Arial"/>
+                                <w:color w:val="000000"/>
+                                <w:kern w:val="0"/>
+                                <w:sz w:val="32"/>
+                                <w:szCs w:val="32"/>
+                                <w:lang w:eastAsia="pt-BR"/>
+                                <w14:ligatures w14:val="none"/>
+                              </w:rPr>
+                              <w:t xml:space="preserve"> </w:t>
+                            </w:r>
+                            <w:proofErr w:type="spellStart"/>
+                            <w:r>
+                              <w:rPr>
+                                <w:rFonts w:ascii="Arial" w:eastAsia="Times New Roman" w:hAnsi="Arial" w:cs="Arial"/>
+                                <w:color w:val="000000"/>
+                                <w:kern w:val="0"/>
+                                <w:sz w:val="32"/>
+                                <w:szCs w:val="32"/>
+                                <w:lang w:eastAsia="pt-BR"/>
+                                <w14:ligatures w14:val="none"/>
+                              </w:rPr>
+                              <w:t>Nasc</w:t>
+                            </w:r>
+                            <w:proofErr w:type="spellEnd"/>
+                            <w:r>
+                              <w:rPr>
+                                <w:rFonts w:ascii="Arial" w:eastAsia="Times New Roman" w:hAnsi="Arial" w:cs="Arial"/>
+                                <w:color w:val="000000"/>
+                                <w:kern w:val="0"/>
+                                <w:sz w:val="32"/>
+                                <w:szCs w:val="32"/>
+                                <w:lang w:eastAsia="pt-BR"/>
+                                <w14:ligatures w14:val="none"/>
+                              </w:rPr>
+                              <w:t>:</w:t>
                             </w:r>
                           </w:p>
                         </w:tc>
@@ -3185,11 +3380,19 @@
                               </w:rPr>
                               <w:t>{</w:t>
                             </w:r>
+                            <w:proofErr w:type="spellStart"/>
                             <w:r>
                               <w:rPr>
                                 <w:rFonts w:cs="Arial"/>
                               </w:rPr>
-                              <w:t>tipoExame}</w:t>
+                              <w:t>tipoExame</w:t>
+                            </w:r>
+                            <w:proofErr w:type="spellEnd"/>
+                            <w:r>
+                              <w:rPr>
+                                <w:rFonts w:cs="Arial"/>
+                              </w:rPr>
+                              <w:t>}</w:t>
                             </w:r>
                           </w:p>
                           <w:p>
@@ -3243,6 +3446,7 @@
                                       <w14:ligatures w14:val="none"/>
                                     </w:rPr>
                                   </w:pPr>
+                                  <w:proofErr w:type="spellStart"/>
                                   <w:r>
                                     <w:rPr>
                                       <w:rFonts w:ascii="Arial" w:eastAsia="Times New Roman" w:hAnsi="Arial" w:cs="Arial"/>
@@ -3253,7 +3457,46 @@
                                       <w:lang w:eastAsia="pt-BR"/>
                                       <w14:ligatures w14:val="none"/>
                                     </w:rPr>
-                                    <w:t>Dt Nasc:</w:t>
+                                    <w:t>Dt</w:t>
+                                  </w:r>
+                                  <w:proofErr w:type="spellEnd"/>
+                                  <w:r>
+                                    <w:rPr>
+                                      <w:rFonts w:ascii="Arial" w:eastAsia="Times New Roman" w:hAnsi="Arial" w:cs="Arial"/>
+                                      <w:color w:val="000000"/>
+                                      <w:kern w:val="0"/>
+                                      <w:sz w:val="32"/>
+                                      <w:szCs w:val="32"/>
+                                      <w:lang w:eastAsia="pt-BR"/>
+                                      <w14:ligatures w14:val="none"/>
+                                    </w:rPr>
+                                    <w:t xml:space="preserve"> </w:t>
+                                  </w:r>
+                                  <w:proofErr w:type="spellStart"/>
+                                  <w:r>
+                                    <w:rPr>
+                                      <w:rFonts w:ascii="Arial" w:eastAsia="Times New Roman" w:hAnsi="Arial" w:cs="Arial"/>
+                                      <w:color w:val="000000"/>
+                                      <w:kern w:val="0"/>
+                                      <w:sz w:val="32"/>
+                                      <w:szCs w:val="32"/>
+                                      <w:lang w:eastAsia="pt-BR"/>
+                                      <w14:ligatures w14:val="none"/>
+                                    </w:rPr>
+                                    <w:t>Nasc</w:t>
+                                  </w:r>
+                                  <w:proofErr w:type="spellEnd"/>
+                                  <w:r>
+                                    <w:rPr>
+                                      <w:rFonts w:ascii="Arial" w:eastAsia="Times New Roman" w:hAnsi="Arial" w:cs="Arial"/>
+                                      <w:color w:val="000000"/>
+                                      <w:kern w:val="0"/>
+                                      <w:sz w:val="32"/>
+                                      <w:szCs w:val="32"/>
+                                      <w:lang w:eastAsia="pt-BR"/>
+                                      <w14:ligatures w14:val="none"/>
+                                    </w:rPr>
+                                    <w:t>:</w:t>
                                   </w:r>
                                 </w:p>
                               </w:tc>
@@ -3354,11 +3597,19 @@
                         </w:rPr>
                         <w:t>{</w:t>
                       </w:r>
+                      <w:proofErr w:type="spellStart"/>
                       <w:r>
                         <w:rPr>
                           <w:rFonts w:cs="Arial"/>
                         </w:rPr>
-                        <w:t>tipoExame}</w:t>
+                        <w:t>tipoExame</w:t>
+                      </w:r>
+                      <w:proofErr w:type="spellEnd"/>
+                      <w:r>
+                        <w:rPr>
+                          <w:rFonts w:cs="Arial"/>
+                        </w:rPr>
+                        <w:t>}</w:t>
                       </w:r>
                     </w:p>
                     <w:p>
@@ -3412,6 +3663,7 @@
                                 <w14:ligatures w14:val="none"/>
                               </w:rPr>
                             </w:pPr>
+                            <w:proofErr w:type="spellStart"/>
                             <w:r>
                               <w:rPr>
                                 <w:rFonts w:ascii="Arial" w:eastAsia="Times New Roman" w:hAnsi="Arial" w:cs="Arial"/>
@@ -3422,7 +3674,46 @@
                                 <w:lang w:eastAsia="pt-BR"/>
                                 <w14:ligatures w14:val="none"/>
                               </w:rPr>
-                              <w:t>Dt Nasc:</w:t>
+                              <w:t>Dt</w:t>
+                            </w:r>
+                            <w:proofErr w:type="spellEnd"/>
+                            <w:r>
+                              <w:rPr>
+                                <w:rFonts w:ascii="Arial" w:eastAsia="Times New Roman" w:hAnsi="Arial" w:cs="Arial"/>
+                                <w:color w:val="000000"/>
+                                <w:kern w:val="0"/>
+                                <w:sz w:val="32"/>
+                                <w:szCs w:val="32"/>
+                                <w:lang w:eastAsia="pt-BR"/>
+                                <w14:ligatures w14:val="none"/>
+                              </w:rPr>
+                              <w:t xml:space="preserve"> </w:t>
+                            </w:r>
+                            <w:proofErr w:type="spellStart"/>
+                            <w:r>
+                              <w:rPr>
+                                <w:rFonts w:ascii="Arial" w:eastAsia="Times New Roman" w:hAnsi="Arial" w:cs="Arial"/>
+                                <w:color w:val="000000"/>
+                                <w:kern w:val="0"/>
+                                <w:sz w:val="32"/>
+                                <w:szCs w:val="32"/>
+                                <w:lang w:eastAsia="pt-BR"/>
+                                <w14:ligatures w14:val="none"/>
+                              </w:rPr>
+                              <w:t>Nasc</w:t>
+                            </w:r>
+                            <w:proofErr w:type="spellEnd"/>
+                            <w:r>
+                              <w:rPr>
+                                <w:rFonts w:ascii="Arial" w:eastAsia="Times New Roman" w:hAnsi="Arial" w:cs="Arial"/>
+                                <w:color w:val="000000"/>
+                                <w:kern w:val="0"/>
+                                <w:sz w:val="32"/>
+                                <w:szCs w:val="32"/>
+                                <w:lang w:eastAsia="pt-BR"/>
+                                <w14:ligatures w14:val="none"/>
+                              </w:rPr>
+                              <w:t>:</w:t>
                             </w:r>
                           </w:p>
                         </w:tc>
@@ -3559,11 +3850,19 @@
                               </w:rPr>
                               <w:t>{</w:t>
                             </w:r>
+                            <w:proofErr w:type="spellStart"/>
                             <w:r>
                               <w:rPr>
                                 <w:rFonts w:cs="Arial"/>
                               </w:rPr>
-                              <w:t>dataExame}</w:t>
+                              <w:t>dataExame</w:t>
+                            </w:r>
+                            <w:proofErr w:type="spellEnd"/>
+                            <w:r>
+                              <w:rPr>
+                                <w:rFonts w:cs="Arial"/>
+                              </w:rPr>
+                              <w:t>}</w:t>
                             </w:r>
                           </w:p>
                           <w:tbl>
@@ -3632,7 +3931,33 @@
                                       <w:lang w:eastAsia="pt-BR"/>
                                       <w14:ligatures w14:val="none"/>
                                     </w:rPr>
-                                    <w:t xml:space="preserve"> Nasc:</w:t>
+                                    <w:t xml:space="preserve"> </w:t>
+                                  </w:r>
+                                  <w:proofErr w:type="spellStart"/>
+                                  <w:r>
+                                    <w:rPr>
+                                      <w:rFonts w:ascii="Arial" w:eastAsia="Times New Roman" w:hAnsi="Arial" w:cs="Arial"/>
+                                      <w:color w:val="000000"/>
+                                      <w:kern w:val="0"/>
+                                      <w:sz w:val="32"/>
+                                      <w:szCs w:val="32"/>
+                                      <w:lang w:eastAsia="pt-BR"/>
+                                      <w14:ligatures w14:val="none"/>
+                                    </w:rPr>
+                                    <w:t>Nasc</w:t>
+                                  </w:r>
+                                  <w:proofErr w:type="spellEnd"/>
+                                  <w:r>
+                                    <w:rPr>
+                                      <w:rFonts w:ascii="Arial" w:eastAsia="Times New Roman" w:hAnsi="Arial" w:cs="Arial"/>
+                                      <w:color w:val="000000"/>
+                                      <w:kern w:val="0"/>
+                                      <w:sz w:val="32"/>
+                                      <w:szCs w:val="32"/>
+                                      <w:lang w:eastAsia="pt-BR"/>
+                                      <w14:ligatures w14:val="none"/>
+                                    </w:rPr>
+                                    <w:t>:</w:t>
                                   </w:r>
                                 </w:p>
                               </w:tc>
@@ -3733,11 +4058,19 @@
                         </w:rPr>
                         <w:t>{</w:t>
                       </w:r>
+                      <w:proofErr w:type="spellStart"/>
                       <w:r>
                         <w:rPr>
                           <w:rFonts w:cs="Arial"/>
                         </w:rPr>
-                        <w:t>dataExame}</w:t>
+                        <w:t>dataExame</w:t>
+                      </w:r>
+                      <w:proofErr w:type="spellEnd"/>
+                      <w:r>
+                        <w:rPr>
+                          <w:rFonts w:cs="Arial"/>
+                        </w:rPr>
+                        <w:t>}</w:t>
                       </w:r>
                     </w:p>
                     <w:tbl>
@@ -3806,7 +4139,33 @@
                                 <w:lang w:eastAsia="pt-BR"/>
                                 <w14:ligatures w14:val="none"/>
                               </w:rPr>
-                              <w:t xml:space="preserve"> Nasc:</w:t>
+                              <w:t xml:space="preserve"> </w:t>
+                            </w:r>
+                            <w:proofErr w:type="spellStart"/>
+                            <w:r>
+                              <w:rPr>
+                                <w:rFonts w:ascii="Arial" w:eastAsia="Times New Roman" w:hAnsi="Arial" w:cs="Arial"/>
+                                <w:color w:val="000000"/>
+                                <w:kern w:val="0"/>
+                                <w:sz w:val="32"/>
+                                <w:szCs w:val="32"/>
+                                <w:lang w:eastAsia="pt-BR"/>
+                                <w14:ligatures w14:val="none"/>
+                              </w:rPr>
+                              <w:t>Nasc</w:t>
+                            </w:r>
+                            <w:proofErr w:type="spellEnd"/>
+                            <w:r>
+                              <w:rPr>
+                                <w:rFonts w:ascii="Arial" w:eastAsia="Times New Roman" w:hAnsi="Arial" w:cs="Arial"/>
+                                <w:color w:val="000000"/>
+                                <w:kern w:val="0"/>
+                                <w:sz w:val="32"/>
+                                <w:szCs w:val="32"/>
+                                <w:lang w:eastAsia="pt-BR"/>
+                                <w14:ligatures w14:val="none"/>
+                              </w:rPr>
+                              <w:t>:</w:t>
                             </w:r>
                           </w:p>
                         </w:tc>
@@ -4010,6 +4369,7 @@
                                       <w14:ligatures w14:val="none"/>
                                     </w:rPr>
                                   </w:pPr>
+                                  <w:proofErr w:type="spellStart"/>
                                   <w:r>
                                     <w:rPr>
                                       <w:rFonts w:ascii="Arial" w:eastAsia="Times New Roman" w:hAnsi="Arial" w:cs="Arial"/>
@@ -4020,7 +4380,46 @@
                                       <w:lang w:eastAsia="pt-BR"/>
                                       <w14:ligatures w14:val="none"/>
                                     </w:rPr>
-                                    <w:t>Dt Nasc:</w:t>
+                                    <w:t>Dt</w:t>
+                                  </w:r>
+                                  <w:proofErr w:type="spellEnd"/>
+                                  <w:r>
+                                    <w:rPr>
+                                      <w:rFonts w:ascii="Arial" w:eastAsia="Times New Roman" w:hAnsi="Arial" w:cs="Arial"/>
+                                      <w:color w:val="000000"/>
+                                      <w:kern w:val="0"/>
+                                      <w:sz w:val="32"/>
+                                      <w:szCs w:val="32"/>
+                                      <w:lang w:eastAsia="pt-BR"/>
+                                      <w14:ligatures w14:val="none"/>
+                                    </w:rPr>
+                                    <w:t xml:space="preserve"> </w:t>
+                                  </w:r>
+                                  <w:proofErr w:type="spellStart"/>
+                                  <w:r>
+                                    <w:rPr>
+                                      <w:rFonts w:ascii="Arial" w:eastAsia="Times New Roman" w:hAnsi="Arial" w:cs="Arial"/>
+                                      <w:color w:val="000000"/>
+                                      <w:kern w:val="0"/>
+                                      <w:sz w:val="32"/>
+                                      <w:szCs w:val="32"/>
+                                      <w:lang w:eastAsia="pt-BR"/>
+                                      <w14:ligatures w14:val="none"/>
+                                    </w:rPr>
+                                    <w:t>Nasc</w:t>
+                                  </w:r>
+                                  <w:proofErr w:type="spellEnd"/>
+                                  <w:r>
+                                    <w:rPr>
+                                      <w:rFonts w:ascii="Arial" w:eastAsia="Times New Roman" w:hAnsi="Arial" w:cs="Arial"/>
+                                      <w:color w:val="000000"/>
+                                      <w:kern w:val="0"/>
+                                      <w:sz w:val="32"/>
+                                      <w:szCs w:val="32"/>
+                                      <w:lang w:eastAsia="pt-BR"/>
+                                      <w14:ligatures w14:val="none"/>
+                                    </w:rPr>
+                                    <w:t>:</w:t>
                                   </w:r>
                                 </w:p>
                               </w:tc>
@@ -4188,6 +4587,7 @@
                                 <w14:ligatures w14:val="none"/>
                               </w:rPr>
                             </w:pPr>
+                            <w:proofErr w:type="spellStart"/>
                             <w:r>
                               <w:rPr>
                                 <w:rFonts w:ascii="Arial" w:eastAsia="Times New Roman" w:hAnsi="Arial" w:cs="Arial"/>
@@ -4198,7 +4598,46 @@
                                 <w:lang w:eastAsia="pt-BR"/>
                                 <w14:ligatures w14:val="none"/>
                               </w:rPr>
-                              <w:t>Dt Nasc:</w:t>
+                              <w:t>Dt</w:t>
+                            </w:r>
+                            <w:proofErr w:type="spellEnd"/>
+                            <w:r>
+                              <w:rPr>
+                                <w:rFonts w:ascii="Arial" w:eastAsia="Times New Roman" w:hAnsi="Arial" w:cs="Arial"/>
+                                <w:color w:val="000000"/>
+                                <w:kern w:val="0"/>
+                                <w:sz w:val="32"/>
+                                <w:szCs w:val="32"/>
+                                <w:lang w:eastAsia="pt-BR"/>
+                                <w14:ligatures w14:val="none"/>
+                              </w:rPr>
+                              <w:t xml:space="preserve"> </w:t>
+                            </w:r>
+                            <w:proofErr w:type="spellStart"/>
+                            <w:r>
+                              <w:rPr>
+                                <w:rFonts w:ascii="Arial" w:eastAsia="Times New Roman" w:hAnsi="Arial" w:cs="Arial"/>
+                                <w:color w:val="000000"/>
+                                <w:kern w:val="0"/>
+                                <w:sz w:val="32"/>
+                                <w:szCs w:val="32"/>
+                                <w:lang w:eastAsia="pt-BR"/>
+                                <w14:ligatures w14:val="none"/>
+                              </w:rPr>
+                              <w:t>Nasc</w:t>
+                            </w:r>
+                            <w:proofErr w:type="spellEnd"/>
+                            <w:r>
+                              <w:rPr>
+                                <w:rFonts w:ascii="Arial" w:eastAsia="Times New Roman" w:hAnsi="Arial" w:cs="Arial"/>
+                                <w:color w:val="000000"/>
+                                <w:kern w:val="0"/>
+                                <w:sz w:val="32"/>
+                                <w:szCs w:val="32"/>
+                                <w:lang w:eastAsia="pt-BR"/>
+                                <w14:ligatures w14:val="none"/>
+                              </w:rPr>
+                              <w:t>:</w:t>
                             </w:r>
                           </w:p>
                         </w:tc>
@@ -4351,7 +4790,21 @@
                               <w:rPr>
                                 <w:rFonts w:cs="Arial"/>
                               </w:rPr>
-                              <w:t>{funcao}</w:t>
+                              <w:t>{</w:t>
+                            </w:r>
+                            <w:proofErr w:type="spellStart"/>
+                            <w:r>
+                              <w:rPr>
+                                <w:rFonts w:cs="Arial"/>
+                              </w:rPr>
+                              <w:t>funcao</w:t>
+                            </w:r>
+                            <w:proofErr w:type="spellEnd"/>
+                            <w:r>
+                              <w:rPr>
+                                <w:rFonts w:cs="Arial"/>
+                              </w:rPr>
+                              <w:t>}</w:t>
                             </w:r>
                           </w:p>
                           <w:tbl>
@@ -4398,6 +4851,7 @@
                                       <w14:ligatures w14:val="none"/>
                                     </w:rPr>
                                   </w:pPr>
+                                  <w:proofErr w:type="spellStart"/>
                                   <w:r>
                                     <w:rPr>
                                       <w:rFonts w:ascii="Arial" w:eastAsia="Times New Roman" w:hAnsi="Arial" w:cs="Arial"/>
@@ -4408,7 +4862,46 @@
                                       <w:lang w:eastAsia="pt-BR"/>
                                       <w14:ligatures w14:val="none"/>
                                     </w:rPr>
-                                    <w:t>Dt Nasc:</w:t>
+                                    <w:t>Dt</w:t>
+                                  </w:r>
+                                  <w:proofErr w:type="spellEnd"/>
+                                  <w:r>
+                                    <w:rPr>
+                                      <w:rFonts w:ascii="Arial" w:eastAsia="Times New Roman" w:hAnsi="Arial" w:cs="Arial"/>
+                                      <w:color w:val="000000"/>
+                                      <w:kern w:val="0"/>
+                                      <w:sz w:val="32"/>
+                                      <w:szCs w:val="32"/>
+                                      <w:lang w:eastAsia="pt-BR"/>
+                                      <w14:ligatures w14:val="none"/>
+                                    </w:rPr>
+                                    <w:t xml:space="preserve"> </w:t>
+                                  </w:r>
+                                  <w:proofErr w:type="spellStart"/>
+                                  <w:r>
+                                    <w:rPr>
+                                      <w:rFonts w:ascii="Arial" w:eastAsia="Times New Roman" w:hAnsi="Arial" w:cs="Arial"/>
+                                      <w:color w:val="000000"/>
+                                      <w:kern w:val="0"/>
+                                      <w:sz w:val="32"/>
+                                      <w:szCs w:val="32"/>
+                                      <w:lang w:eastAsia="pt-BR"/>
+                                      <w14:ligatures w14:val="none"/>
+                                    </w:rPr>
+                                    <w:t>Nasc</w:t>
+                                  </w:r>
+                                  <w:proofErr w:type="spellEnd"/>
+                                  <w:r>
+                                    <w:rPr>
+                                      <w:rFonts w:ascii="Arial" w:eastAsia="Times New Roman" w:hAnsi="Arial" w:cs="Arial"/>
+                                      <w:color w:val="000000"/>
+                                      <w:kern w:val="0"/>
+                                      <w:sz w:val="32"/>
+                                      <w:szCs w:val="32"/>
+                                      <w:lang w:eastAsia="pt-BR"/>
+                                      <w14:ligatures w14:val="none"/>
+                                    </w:rPr>
+                                    <w:t>:</w:t>
                                   </w:r>
                                 </w:p>
                               </w:tc>
@@ -4525,7 +5018,21 @@
                         <w:rPr>
                           <w:rFonts w:cs="Arial"/>
                         </w:rPr>
-                        <w:t>{funcao}</w:t>
+                        <w:t>{</w:t>
+                      </w:r>
+                      <w:proofErr w:type="spellStart"/>
+                      <w:r>
+                        <w:rPr>
+                          <w:rFonts w:cs="Arial"/>
+                        </w:rPr>
+                        <w:t>funcao</w:t>
+                      </w:r>
+                      <w:proofErr w:type="spellEnd"/>
+                      <w:r>
+                        <w:rPr>
+                          <w:rFonts w:cs="Arial"/>
+                        </w:rPr>
+                        <w:t>}</w:t>
                       </w:r>
                     </w:p>
                     <w:tbl>
@@ -4572,6 +5079,7 @@
                                 <w14:ligatures w14:val="none"/>
                               </w:rPr>
                             </w:pPr>
+                            <w:proofErr w:type="spellStart"/>
                             <w:r>
                               <w:rPr>
                                 <w:rFonts w:ascii="Arial" w:eastAsia="Times New Roman" w:hAnsi="Arial" w:cs="Arial"/>
@@ -4582,7 +5090,46 @@
                                 <w:lang w:eastAsia="pt-BR"/>
                                 <w14:ligatures w14:val="none"/>
                               </w:rPr>
-                              <w:t>Dt Nasc:</w:t>
+                              <w:t>Dt</w:t>
+                            </w:r>
+                            <w:proofErr w:type="spellEnd"/>
+                            <w:r>
+                              <w:rPr>
+                                <w:rFonts w:ascii="Arial" w:eastAsia="Times New Roman" w:hAnsi="Arial" w:cs="Arial"/>
+                                <w:color w:val="000000"/>
+                                <w:kern w:val="0"/>
+                                <w:sz w:val="32"/>
+                                <w:szCs w:val="32"/>
+                                <w:lang w:eastAsia="pt-BR"/>
+                                <w14:ligatures w14:val="none"/>
+                              </w:rPr>
+                              <w:t xml:space="preserve"> </w:t>
+                            </w:r>
+                            <w:proofErr w:type="spellStart"/>
+                            <w:r>
+                              <w:rPr>
+                                <w:rFonts w:ascii="Arial" w:eastAsia="Times New Roman" w:hAnsi="Arial" w:cs="Arial"/>
+                                <w:color w:val="000000"/>
+                                <w:kern w:val="0"/>
+                                <w:sz w:val="32"/>
+                                <w:szCs w:val="32"/>
+                                <w:lang w:eastAsia="pt-BR"/>
+                                <w14:ligatures w14:val="none"/>
+                              </w:rPr>
+                              <w:t>Nasc</w:t>
+                            </w:r>
+                            <w:proofErr w:type="spellEnd"/>
+                            <w:r>
+                              <w:rPr>
+                                <w:rFonts w:ascii="Arial" w:eastAsia="Times New Roman" w:hAnsi="Arial" w:cs="Arial"/>
+                                <w:color w:val="000000"/>
+                                <w:kern w:val="0"/>
+                                <w:sz w:val="32"/>
+                                <w:szCs w:val="32"/>
+                                <w:lang w:eastAsia="pt-BR"/>
+                                <w14:ligatures w14:val="none"/>
+                              </w:rPr>
+                              <w:t>:</w:t>
                             </w:r>
                           </w:p>
                         </w:tc>
@@ -4794,6 +5341,7 @@
                                       <w14:ligatures w14:val="none"/>
                                     </w:rPr>
                                   </w:pPr>
+                                  <w:proofErr w:type="spellStart"/>
                                   <w:r>
                                     <w:rPr>
                                       <w:rFonts w:ascii="Arial" w:eastAsia="Times New Roman" w:hAnsi="Arial" w:cs="Arial"/>
@@ -4804,7 +5352,46 @@
                                       <w:lang w:eastAsia="pt-BR"/>
                                       <w14:ligatures w14:val="none"/>
                                     </w:rPr>
-                                    <w:t>Dt Nasc:</w:t>
+                                    <w:t>Dt</w:t>
+                                  </w:r>
+                                  <w:proofErr w:type="spellEnd"/>
+                                  <w:r>
+                                    <w:rPr>
+                                      <w:rFonts w:ascii="Arial" w:eastAsia="Times New Roman" w:hAnsi="Arial" w:cs="Arial"/>
+                                      <w:color w:val="000000"/>
+                                      <w:kern w:val="0"/>
+                                      <w:sz w:val="32"/>
+                                      <w:szCs w:val="32"/>
+                                      <w:lang w:eastAsia="pt-BR"/>
+                                      <w14:ligatures w14:val="none"/>
+                                    </w:rPr>
+                                    <w:t xml:space="preserve"> </w:t>
+                                  </w:r>
+                                  <w:proofErr w:type="spellStart"/>
+                                  <w:r>
+                                    <w:rPr>
+                                      <w:rFonts w:ascii="Arial" w:eastAsia="Times New Roman" w:hAnsi="Arial" w:cs="Arial"/>
+                                      <w:color w:val="000000"/>
+                                      <w:kern w:val="0"/>
+                                      <w:sz w:val="32"/>
+                                      <w:szCs w:val="32"/>
+                                      <w:lang w:eastAsia="pt-BR"/>
+                                      <w14:ligatures w14:val="none"/>
+                                    </w:rPr>
+                                    <w:t>Nasc</w:t>
+                                  </w:r>
+                                  <w:proofErr w:type="spellEnd"/>
+                                  <w:r>
+                                    <w:rPr>
+                                      <w:rFonts w:ascii="Arial" w:eastAsia="Times New Roman" w:hAnsi="Arial" w:cs="Arial"/>
+                                      <w:color w:val="000000"/>
+                                      <w:kern w:val="0"/>
+                                      <w:sz w:val="32"/>
+                                      <w:szCs w:val="32"/>
+                                      <w:lang w:eastAsia="pt-BR"/>
+                                      <w14:ligatures w14:val="none"/>
+                                    </w:rPr>
+                                    <w:t>:</w:t>
                                   </w:r>
                                 </w:p>
                               </w:tc>
@@ -4980,6 +5567,7 @@
                                 <w14:ligatures w14:val="none"/>
                               </w:rPr>
                             </w:pPr>
+                            <w:proofErr w:type="spellStart"/>
                             <w:r>
                               <w:rPr>
                                 <w:rFonts w:ascii="Arial" w:eastAsia="Times New Roman" w:hAnsi="Arial" w:cs="Arial"/>
@@ -4990,7 +5578,46 @@
                                 <w:lang w:eastAsia="pt-BR"/>
                                 <w14:ligatures w14:val="none"/>
                               </w:rPr>
-                              <w:t>Dt Nasc:</w:t>
+                              <w:t>Dt</w:t>
+                            </w:r>
+                            <w:proofErr w:type="spellEnd"/>
+                            <w:r>
+                              <w:rPr>
+                                <w:rFonts w:ascii="Arial" w:eastAsia="Times New Roman" w:hAnsi="Arial" w:cs="Arial"/>
+                                <w:color w:val="000000"/>
+                                <w:kern w:val="0"/>
+                                <w:sz w:val="32"/>
+                                <w:szCs w:val="32"/>
+                                <w:lang w:eastAsia="pt-BR"/>
+                                <w14:ligatures w14:val="none"/>
+                              </w:rPr>
+                              <w:t xml:space="preserve"> </w:t>
+                            </w:r>
+                            <w:proofErr w:type="spellStart"/>
+                            <w:r>
+                              <w:rPr>
+                                <w:rFonts w:ascii="Arial" w:eastAsia="Times New Roman" w:hAnsi="Arial" w:cs="Arial"/>
+                                <w:color w:val="000000"/>
+                                <w:kern w:val="0"/>
+                                <w:sz w:val="32"/>
+                                <w:szCs w:val="32"/>
+                                <w:lang w:eastAsia="pt-BR"/>
+                                <w14:ligatures w14:val="none"/>
+                              </w:rPr>
+                              <w:t>Nasc</w:t>
+                            </w:r>
+                            <w:proofErr w:type="spellEnd"/>
+                            <w:r>
+                              <w:rPr>
+                                <w:rFonts w:ascii="Arial" w:eastAsia="Times New Roman" w:hAnsi="Arial" w:cs="Arial"/>
+                                <w:color w:val="000000"/>
+                                <w:kern w:val="0"/>
+                                <w:sz w:val="32"/>
+                                <w:szCs w:val="32"/>
+                                <w:lang w:eastAsia="pt-BR"/>
+                                <w14:ligatures w14:val="none"/>
+                              </w:rPr>
+                              <w:t>:</w:t>
                             </w:r>
                           </w:p>
                         </w:tc>
@@ -5186,6 +5813,7 @@
                                       <w14:ligatures w14:val="none"/>
                                     </w:rPr>
                                   </w:pPr>
+                                  <w:proofErr w:type="spellStart"/>
                                   <w:r>
                                     <w:rPr>
                                       <w:rFonts w:ascii="Arial" w:eastAsia="Times New Roman" w:hAnsi="Arial" w:cs="Arial"/>
@@ -5196,7 +5824,46 @@
                                       <w:lang w:eastAsia="pt-BR"/>
                                       <w14:ligatures w14:val="none"/>
                                     </w:rPr>
-                                    <w:t>Dt Nasc:</w:t>
+                                    <w:t>Dt</w:t>
+                                  </w:r>
+                                  <w:proofErr w:type="spellEnd"/>
+                                  <w:r>
+                                    <w:rPr>
+                                      <w:rFonts w:ascii="Arial" w:eastAsia="Times New Roman" w:hAnsi="Arial" w:cs="Arial"/>
+                                      <w:color w:val="000000"/>
+                                      <w:kern w:val="0"/>
+                                      <w:sz w:val="32"/>
+                                      <w:szCs w:val="32"/>
+                                      <w:lang w:eastAsia="pt-BR"/>
+                                      <w14:ligatures w14:val="none"/>
+                                    </w:rPr>
+                                    <w:t xml:space="preserve"> </w:t>
+                                  </w:r>
+                                  <w:proofErr w:type="spellStart"/>
+                                  <w:r>
+                                    <w:rPr>
+                                      <w:rFonts w:ascii="Arial" w:eastAsia="Times New Roman" w:hAnsi="Arial" w:cs="Arial"/>
+                                      <w:color w:val="000000"/>
+                                      <w:kern w:val="0"/>
+                                      <w:sz w:val="32"/>
+                                      <w:szCs w:val="32"/>
+                                      <w:lang w:eastAsia="pt-BR"/>
+                                      <w14:ligatures w14:val="none"/>
+                                    </w:rPr>
+                                    <w:t>Nasc</w:t>
+                                  </w:r>
+                                  <w:proofErr w:type="spellEnd"/>
+                                  <w:r>
+                                    <w:rPr>
+                                      <w:rFonts w:ascii="Arial" w:eastAsia="Times New Roman" w:hAnsi="Arial" w:cs="Arial"/>
+                                      <w:color w:val="000000"/>
+                                      <w:kern w:val="0"/>
+                                      <w:sz w:val="32"/>
+                                      <w:szCs w:val="32"/>
+                                      <w:lang w:eastAsia="pt-BR"/>
+                                      <w14:ligatures w14:val="none"/>
+                                    </w:rPr>
+                                    <w:t>:</w:t>
                                   </w:r>
                                 </w:p>
                               </w:tc>
@@ -5356,6 +6023,7 @@
                                 <w14:ligatures w14:val="none"/>
                               </w:rPr>
                             </w:pPr>
+                            <w:proofErr w:type="spellStart"/>
                             <w:r>
                               <w:rPr>
                                 <w:rFonts w:ascii="Arial" w:eastAsia="Times New Roman" w:hAnsi="Arial" w:cs="Arial"/>
@@ -5366,7 +6034,46 @@
                                 <w:lang w:eastAsia="pt-BR"/>
                                 <w14:ligatures w14:val="none"/>
                               </w:rPr>
-                              <w:t>Dt Nasc:</w:t>
+                              <w:t>Dt</w:t>
+                            </w:r>
+                            <w:proofErr w:type="spellEnd"/>
+                            <w:r>
+                              <w:rPr>
+                                <w:rFonts w:ascii="Arial" w:eastAsia="Times New Roman" w:hAnsi="Arial" w:cs="Arial"/>
+                                <w:color w:val="000000"/>
+                                <w:kern w:val="0"/>
+                                <w:sz w:val="32"/>
+                                <w:szCs w:val="32"/>
+                                <w:lang w:eastAsia="pt-BR"/>
+                                <w14:ligatures w14:val="none"/>
+                              </w:rPr>
+                              <w:t xml:space="preserve"> </w:t>
+                            </w:r>
+                            <w:proofErr w:type="spellStart"/>
+                            <w:r>
+                              <w:rPr>
+                                <w:rFonts w:ascii="Arial" w:eastAsia="Times New Roman" w:hAnsi="Arial" w:cs="Arial"/>
+                                <w:color w:val="000000"/>
+                                <w:kern w:val="0"/>
+                                <w:sz w:val="32"/>
+                                <w:szCs w:val="32"/>
+                                <w:lang w:eastAsia="pt-BR"/>
+                                <w14:ligatures w14:val="none"/>
+                              </w:rPr>
+                              <w:t>Nasc</w:t>
+                            </w:r>
+                            <w:proofErr w:type="spellEnd"/>
+                            <w:r>
+                              <w:rPr>
+                                <w:rFonts w:ascii="Arial" w:eastAsia="Times New Roman" w:hAnsi="Arial" w:cs="Arial"/>
+                                <w:color w:val="000000"/>
+                                <w:kern w:val="0"/>
+                                <w:sz w:val="32"/>
+                                <w:szCs w:val="32"/>
+                                <w:lang w:eastAsia="pt-BR"/>
+                                <w14:ligatures w14:val="none"/>
+                              </w:rPr>
+                              <w:t>:</w:t>
                             </w:r>
                           </w:p>
                         </w:tc>
@@ -5511,11 +6218,19 @@
                               </w:rPr>
                               <w:t>{</w:t>
                             </w:r>
+                            <w:proofErr w:type="spellStart"/>
                             <w:r>
                               <w:rPr>
                                 <w:rFonts w:cs="Arial"/>
                               </w:rPr>
-                              <w:t>cpf}</w:t>
+                              <w:t>cpf</w:t>
+                            </w:r>
+                            <w:proofErr w:type="spellEnd"/>
+                            <w:r>
+                              <w:rPr>
+                                <w:rFonts w:cs="Arial"/>
+                              </w:rPr>
+                              <w:t>}</w:t>
                             </w:r>
                           </w:p>
                           <w:tbl>
@@ -5562,6 +6277,7 @@
                                       <w14:ligatures w14:val="none"/>
                                     </w:rPr>
                                   </w:pPr>
+                                  <w:proofErr w:type="spellStart"/>
                                   <w:r>
                                     <w:rPr>
                                       <w:rFonts w:ascii="Arial" w:eastAsia="Times New Roman" w:hAnsi="Arial" w:cs="Arial"/>
@@ -5572,7 +6288,46 @@
                                       <w:lang w:eastAsia="pt-BR"/>
                                       <w14:ligatures w14:val="none"/>
                                     </w:rPr>
-                                    <w:t>Dt Nasc:</w:t>
+                                    <w:t>Dt</w:t>
+                                  </w:r>
+                                  <w:proofErr w:type="spellEnd"/>
+                                  <w:r>
+                                    <w:rPr>
+                                      <w:rFonts w:ascii="Arial" w:eastAsia="Times New Roman" w:hAnsi="Arial" w:cs="Arial"/>
+                                      <w:color w:val="000000"/>
+                                      <w:kern w:val="0"/>
+                                      <w:sz w:val="32"/>
+                                      <w:szCs w:val="32"/>
+                                      <w:lang w:eastAsia="pt-BR"/>
+                                      <w14:ligatures w14:val="none"/>
+                                    </w:rPr>
+                                    <w:t xml:space="preserve"> </w:t>
+                                  </w:r>
+                                  <w:proofErr w:type="spellStart"/>
+                                  <w:r>
+                                    <w:rPr>
+                                      <w:rFonts w:ascii="Arial" w:eastAsia="Times New Roman" w:hAnsi="Arial" w:cs="Arial"/>
+                                      <w:color w:val="000000"/>
+                                      <w:kern w:val="0"/>
+                                      <w:sz w:val="32"/>
+                                      <w:szCs w:val="32"/>
+                                      <w:lang w:eastAsia="pt-BR"/>
+                                      <w14:ligatures w14:val="none"/>
+                                    </w:rPr>
+                                    <w:t>Nasc</w:t>
+                                  </w:r>
+                                  <w:proofErr w:type="spellEnd"/>
+                                  <w:r>
+                                    <w:rPr>
+                                      <w:rFonts w:ascii="Arial" w:eastAsia="Times New Roman" w:hAnsi="Arial" w:cs="Arial"/>
+                                      <w:color w:val="000000"/>
+                                      <w:kern w:val="0"/>
+                                      <w:sz w:val="32"/>
+                                      <w:szCs w:val="32"/>
+                                      <w:lang w:eastAsia="pt-BR"/>
+                                      <w14:ligatures w14:val="none"/>
+                                    </w:rPr>
+                                    <w:t>:</w:t>
                                   </w:r>
                                 </w:p>
                               </w:tc>
@@ -5681,11 +6436,19 @@
                         </w:rPr>
                         <w:t>{</w:t>
                       </w:r>
+                      <w:proofErr w:type="spellStart"/>
                       <w:r>
                         <w:rPr>
                           <w:rFonts w:cs="Arial"/>
                         </w:rPr>
-                        <w:t>cpf}</w:t>
+                        <w:t>cpf</w:t>
+                      </w:r>
+                      <w:proofErr w:type="spellEnd"/>
+                      <w:r>
+                        <w:rPr>
+                          <w:rFonts w:cs="Arial"/>
+                        </w:rPr>
+                        <w:t>}</w:t>
                       </w:r>
                     </w:p>
                     <w:tbl>
@@ -5732,6 +6495,7 @@
                                 <w14:ligatures w14:val="none"/>
                               </w:rPr>
                             </w:pPr>
+                            <w:proofErr w:type="spellStart"/>
                             <w:r>
                               <w:rPr>
                                 <w:rFonts w:ascii="Arial" w:eastAsia="Times New Roman" w:hAnsi="Arial" w:cs="Arial"/>
@@ -5742,7 +6506,46 @@
                                 <w:lang w:eastAsia="pt-BR"/>
                                 <w14:ligatures w14:val="none"/>
                               </w:rPr>
-                              <w:t>Dt Nasc:</w:t>
+                              <w:t>Dt</w:t>
+                            </w:r>
+                            <w:proofErr w:type="spellEnd"/>
+                            <w:r>
+                              <w:rPr>
+                                <w:rFonts w:ascii="Arial" w:eastAsia="Times New Roman" w:hAnsi="Arial" w:cs="Arial"/>
+                                <w:color w:val="000000"/>
+                                <w:kern w:val="0"/>
+                                <w:sz w:val="32"/>
+                                <w:szCs w:val="32"/>
+                                <w:lang w:eastAsia="pt-BR"/>
+                                <w14:ligatures w14:val="none"/>
+                              </w:rPr>
+                              <w:t xml:space="preserve"> </w:t>
+                            </w:r>
+                            <w:proofErr w:type="spellStart"/>
+                            <w:r>
+                              <w:rPr>
+                                <w:rFonts w:ascii="Arial" w:eastAsia="Times New Roman" w:hAnsi="Arial" w:cs="Arial"/>
+                                <w:color w:val="000000"/>
+                                <w:kern w:val="0"/>
+                                <w:sz w:val="32"/>
+                                <w:szCs w:val="32"/>
+                                <w:lang w:eastAsia="pt-BR"/>
+                                <w14:ligatures w14:val="none"/>
+                              </w:rPr>
+                              <w:t>Nasc</w:t>
+                            </w:r>
+                            <w:proofErr w:type="spellEnd"/>
+                            <w:r>
+                              <w:rPr>
+                                <w:rFonts w:ascii="Arial" w:eastAsia="Times New Roman" w:hAnsi="Arial" w:cs="Arial"/>
+                                <w:color w:val="000000"/>
+                                <w:kern w:val="0"/>
+                                <w:sz w:val="32"/>
+                                <w:szCs w:val="32"/>
+                                <w:lang w:eastAsia="pt-BR"/>
+                                <w14:ligatures w14:val="none"/>
+                              </w:rPr>
+                              <w:t>:</w:t>
                             </w:r>
                           </w:p>
                         </w:tc>
@@ -5878,7 +6681,15 @@
           </w:tcPr>
           <w:p>
             <w:r>
-              <w:t>{od}</w:t>
+              <w:t>{</w:t>
+            </w:r>
+            <w:proofErr w:type="spellStart"/>
+            <w:r>
+              <w:t>od</w:t>
+            </w:r>
+            <w:proofErr w:type="spellEnd"/>
+            <w:r>
+              <w:t>}</w:t>
             </w:r>
           </w:p>
         </w:tc>
@@ -5909,7 +6720,15 @@
           </w:tcPr>
           <w:p>
             <w:r>
-              <w:t>{oe}</w:t>
+              <w:t>{</w:t>
+            </w:r>
+            <w:proofErr w:type="spellStart"/>
+            <w:r>
+              <w:t>oe</w:t>
+            </w:r>
+            <w:proofErr w:type="spellEnd"/>
+            <w:r>
+              <w:t>}</w:t>
             </w:r>
           </w:p>
         </w:tc>
@@ -5994,7 +6813,15 @@
                           </w:p>
                           <w:p>
                             <w:r>
-                              <w:t>{obs}</w:t>
+                              <w:t>{</w:t>
+                            </w:r>
+                            <w:proofErr w:type="spellStart"/>
+                            <w:r>
+                              <w:t>obs</w:t>
+                            </w:r>
+                            <w:proofErr w:type="spellEnd"/>
+                            <w:r>
+                              <w:t>}</w:t>
                             </w:r>
                           </w:p>
                           <w:p>

</xml_diff>